<commit_message>
Add personal details section to CV
Adds date of birth, nationality and passport number as a compact three-column
row, plus availability and references, as Gulf applications expect. Both the
PDF and Word renderings stay at three pages.

Co-Authored-By: Claude Opus 5 <noreply@anthropic.com>
Claude-Session: https://claude.ai/code/session_013H3AMzMWzEerJx7AeqeVQp
</commit_message>
<xml_diff>
--- a/AZODO_EMEKA_CV_Rotating_Equipment_Engineer_QatarEnergyLNG.docx
+++ b/AZODO_EMEKA_CV_Rotating_Equipment_Engineer_QatarEnergyLNG.docx
@@ -3298,9 +3298,135 @@
     </w:tbl>
     <w:p>
       <w:pPr>
+        <w:shd w:val="clear" w:color="auto" w:fill="12304F"/>
+        <w:spacing w:before="100" w:after="40" w:line="240" w:lineRule="auto"/>
+      </w:pPr>
+      <w:r>
+        <w:rPr>
+          <w:rFonts w:ascii="Calibri" w:hAnsi="Calibri"/>
+          <w:b/>
+          <w:i w:val="0"/>
+          <w:color w:val="FFFFFF"/>
+          <w:sz w:val="20"/>
+        </w:rPr>
+        <w:t>PERSONAL DETAILS</w:t>
+      </w:r>
+    </w:p>
+    <w:tbl>
+      <w:tblPr>
+        <w:tblW w:type="auto" w:w="0"/>
+        <w:jc w:val="left"/>
+        <w:tblBorders>
+          <w:top w:val="none" w:sz="0" w:space="0" w:color="B8C4CE"/>
+          <w:left w:val="none" w:sz="0" w:space="0" w:color="B8C4CE"/>
+          <w:bottom w:val="none" w:sz="0" w:space="0" w:color="B8C4CE"/>
+          <w:right w:val="none" w:sz="0" w:space="0" w:color="B8C4CE"/>
+          <w:insideH w:val="none" w:sz="0" w:space="0" w:color="B8C4CE"/>
+          <w:insideV w:val="none" w:sz="0" w:space="0" w:color="B8C4CE"/>
+        </w:tblBorders>
+        <w:tblLayout w:type="fixed"/>
+        <w:tblLayout w:type="fixed"/>
+        <w:tblCellMar>
+          <w:top w:w="0" w:type="dxa"/>
+          <w:left w:w="0" w:type="dxa"/>
+          <w:bottom w:w="0" w:type="dxa"/>
+          <w:right w:w="80" w:type="dxa"/>
+        </w:tblCellMar>
+        <w:tblLook w:firstColumn="1" w:firstRow="1" w:lastColumn="0" w:lastRow="0" w:noHBand="0" w:noVBand="1" w:val="04A0"/>
+      </w:tblPr>
+      <w:tblGrid>
+        <w:gridCol w:w="3288"/>
+        <w:gridCol w:w="3288"/>
+        <w:gridCol w:w="3288"/>
+      </w:tblGrid>
+      <w:tr>
+        <w:tc>
+          <w:tcPr>
+            <w:tcW w:type="dxa" w:w="3288"/>
+          </w:tcPr>
+          <w:p>
+            <w:pPr>
+              <w:spacing w:before="0" w:after="20" w:line="240" w:lineRule="auto"/>
+            </w:pPr>
+            <w:r>
+              <w:rPr>
+                <w:rFonts w:ascii="Calibri" w:hAnsi="Calibri"/>
+                <w:b w:val="0"/>
+                <w:i w:val="0"/>
+                <w:color w:val="1A1A1A"/>
+                <w:sz w:val="17"/>
+              </w:rPr>
+              <w:t>• Date of birth: 25 September 1988</w:t>
+            </w:r>
+          </w:p>
+        </w:tc>
+        <w:tc>
+          <w:tcPr>
+            <w:tcW w:type="dxa" w:w="3288"/>
+          </w:tcPr>
+          <w:p>
+            <w:pPr>
+              <w:spacing w:before="0" w:after="20" w:line="240" w:lineRule="auto"/>
+            </w:pPr>
+            <w:r>
+              <w:rPr>
+                <w:rFonts w:ascii="Calibri" w:hAnsi="Calibri"/>
+                <w:b w:val="0"/>
+                <w:i w:val="0"/>
+                <w:color w:val="1A1A1A"/>
+                <w:sz w:val="17"/>
+              </w:rPr>
+              <w:t>• Nationality: Nigerian</w:t>
+            </w:r>
+          </w:p>
+        </w:tc>
+        <w:tc>
+          <w:tcPr>
+            <w:tcW w:type="dxa" w:w="3288"/>
+          </w:tcPr>
+          <w:p>
+            <w:pPr>
+              <w:spacing w:before="0" w:after="20" w:line="240" w:lineRule="auto"/>
+            </w:pPr>
+            <w:r>
+              <w:rPr>
+                <w:rFonts w:ascii="Calibri" w:hAnsi="Calibri"/>
+                <w:b w:val="0"/>
+                <w:i w:val="0"/>
+                <w:color w:val="1A1A1A"/>
+                <w:sz w:val="17"/>
+              </w:rPr>
+              <w:t>• Passport: B03319482 (Nigeria)</w:t>
+            </w:r>
+          </w:p>
+        </w:tc>
+      </w:tr>
+    </w:tbl>
+    <w:p>
+      <w:pPr>
         <w:spacing w:before="0" w:after="50" w:line="240" w:lineRule="auto"/>
         <w:jc w:val="both"/>
       </w:pPr>
+      <w:r>
+        <w:rPr>
+          <w:rFonts w:ascii="Calibri" w:hAnsi="Calibri"/>
+          <w:b/>
+          <w:i w:val="0"/>
+          <w:color w:val="1A1A1A"/>
+          <w:sz w:val="18"/>
+        </w:rPr>
+        <w:t>Availability:</w:t>
+      </w:r>
+      <w:r>
+        <w:rPr>
+          <w:rFonts w:ascii="Calibri" w:hAnsi="Calibri"/>
+          <w:b w:val="0"/>
+          <w:i w:val="0"/>
+          <w:color w:val="1A1A1A"/>
+          <w:sz w:val="18"/>
+        </w:rPr>
+        <w:t xml:space="preserve"> immediate mobilisation for international assignment.   </w:t>
+      </w:r>
       <w:r>
         <w:rPr>
           <w:rFonts w:ascii="Calibri" w:hAnsi="Calibri"/>
@@ -3319,27 +3445,7 @@
           <w:color w:val="1A1A1A"/>
           <w:sz w:val="18"/>
         </w:rPr>
-        <w:t xml:space="preserve"> available on request.   </w:t>
-      </w:r>
-      <w:r>
-        <w:rPr>
-          <w:rFonts w:ascii="Calibri" w:hAnsi="Calibri"/>
-          <w:b/>
-          <w:i w:val="0"/>
-          <w:color w:val="1A1A1A"/>
-          <w:sz w:val="18"/>
-        </w:rPr>
-        <w:t>Notice / availability:</w:t>
-      </w:r>
-      <w:r>
-        <w:rPr>
-          <w:rFonts w:ascii="Calibri" w:hAnsi="Calibri"/>
-          <w:b w:val="0"/>
-          <w:i w:val="0"/>
-          <w:color w:val="1A1A1A"/>
-          <w:sz w:val="18"/>
-        </w:rPr>
-        <w:t xml:space="preserve"> immediate mobilisation for international assignment; valid international passport.</w:t>
+        <w:t xml:space="preserve"> available on request.</w:t>
       </w:r>
     </w:p>
     <w:sectPr>

</xml_diff>